<commit_message>
Restore Plan AURA slogan logo instead of the isolated droplet.
Use the full “Ahorrar agua hoy para compartir mañana” mark in the header, hero, and convocatoria Word banners.

Co-authored-by: Cursor <cursoragent@cursor.com>
</commit_message>
<xml_diff>
--- a/instituto-del-agua/documentos/Convocatoria_y_Plantilla_Proyectos_AURA_2026.docx
+++ b/instituto-del-agua/documentos/Convocatoria_y_Plantilla_Proyectos_AURA_2026.docx
@@ -16,12 +16,12 @@
       <w:tr>
         <w:tc>
           <w:tcPr>
-            <w:tcW w:type="dxa" w:w="1474"/>
-            <w:shd w:fill="0E4F72" w:val="clear"/>
+            <w:tcW w:type="dxa" w:w="2948"/>
+            <w:shd w:fill="FFFFFF" w:val="clear"/>
             <w:tcMar>
-              <w:top w:w="80" w:type="dxa"/>
+              <w:top w:w="60" w:type="dxa"/>
               <w:left w:w="80" w:type="dxa"/>
-              <w:bottom w:w="80" w:type="dxa"/>
+              <w:bottom w:w="60" w:type="dxa"/>
               <w:right w:w="80" w:type="dxa"/>
             </w:tcMar>
           </w:tcPr>
@@ -32,7 +32,7 @@
             <w:r>
               <w:drawing>
                 <wp:inline xmlns:a="http://schemas.openxmlformats.org/drawingml/2006/main" xmlns:pic="http://schemas.openxmlformats.org/drawingml/2006/picture">
-                  <wp:extent cx="666000" cy="666000"/>
+                  <wp:extent cx="1655999" cy="1347906"/>
                   <wp:docPr id="1" name="Picture 1"/>
                   <wp:cNvGraphicFramePr>
                     <a:graphicFrameLocks noChangeAspect="1"/>
@@ -41,7 +41,7 @@
                     <a:graphicData uri="http://schemas.openxmlformats.org/drawingml/2006/picture">
                       <pic:pic>
                         <pic:nvPicPr>
-                          <pic:cNvPr id="0" name="logo-aura-gota.png"/>
+                          <pic:cNvPr id="0" name="logo-aura-slogan-header.png"/>
                           <pic:cNvPicPr/>
                         </pic:nvPicPr>
                         <pic:blipFill>
@@ -53,7 +53,7 @@
                         <pic:spPr>
                           <a:xfrm>
                             <a:off x="0" y="0"/>
-                            <a:ext cx="666000" cy="666000"/>
+                            <a:ext cx="1655999" cy="1347906"/>
                           </a:xfrm>
                           <a:prstGeom prst="rect"/>
                         </pic:spPr>
@@ -67,12 +67,12 @@
         </w:tc>
         <w:tc>
           <w:tcPr>
-            <w:tcW w:type="dxa" w:w="8220"/>
-            <w:shd w:fill="0E4F72" w:val="clear"/>
+            <w:tcW w:type="dxa" w:w="6746"/>
+            <w:shd w:fill="FFFFFF" w:val="clear"/>
             <w:tcMar>
-              <w:top w:w="80" w:type="dxa"/>
+              <w:top w:w="60" w:type="dxa"/>
               <w:left w:w="80" w:type="dxa"/>
-              <w:bottom w:w="80" w:type="dxa"/>
+              <w:bottom w:w="60" w:type="dxa"/>
               <w:right w:w="80" w:type="dxa"/>
             </w:tcMar>
           </w:tcPr>
@@ -86,7 +86,7 @@
                 <w:rFonts w:ascii="Arial" w:hAnsi="Arial" w:eastAsia="Arial"/>
                 <w:b w:val="0"/>
                 <w:i w:val="0"/>
-                <w:color w:val="FFFFFF"/>
+                <w:color w:val="5C4F54"/>
                 <w:sz w:val="16"/>
               </w:rPr>
               <w:t>UNIVERSIDAD CATÓLICA DE CUYO · Secretaría de Investigación y Extensión</w:t>
@@ -102,8 +102,8 @@
                 <w:rFonts w:ascii="Arial" w:hAnsi="Arial" w:eastAsia="Arial"/>
                 <w:b/>
                 <w:i w:val="0"/>
-                <w:color w:val="FFFFFF"/>
-                <w:sz w:val="26"/>
+                <w:color w:val="0E4F72"/>
+                <w:sz w:val="24"/>
               </w:rPr>
               <w:t>Plan Integral AURA · Convocatoria 2026</w:t>
             </w:r>
@@ -118,7 +118,7 @@
                 <w:rFonts w:ascii="Arial" w:hAnsi="Arial" w:eastAsia="Arial"/>
                 <w:b w:val="0"/>
                 <w:i w:val="0"/>
-                <w:color w:val="FFFFFF"/>
+                <w:color w:val="5C4F54"/>
                 <w:sz w:val="18"/>
               </w:rPr>
               <w:t>Documento único: bases de la convocatoria + Anexo I de presentación de proyectos</w:t>
@@ -1733,12 +1733,12 @@
       <w:tr>
         <w:tc>
           <w:tcPr>
-            <w:tcW w:type="dxa" w:w="1474"/>
-            <w:shd w:fill="0E4F72" w:val="clear"/>
+            <w:tcW w:type="dxa" w:w="2948"/>
+            <w:shd w:fill="FFFFFF" w:val="clear"/>
             <w:tcMar>
-              <w:top w:w="80" w:type="dxa"/>
+              <w:top w:w="60" w:type="dxa"/>
               <w:left w:w="80" w:type="dxa"/>
-              <w:bottom w:w="80" w:type="dxa"/>
+              <w:bottom w:w="60" w:type="dxa"/>
               <w:right w:w="80" w:type="dxa"/>
             </w:tcMar>
           </w:tcPr>
@@ -1749,7 +1749,7 @@
             <w:r>
               <w:drawing>
                 <wp:inline xmlns:a="http://schemas.openxmlformats.org/drawingml/2006/main" xmlns:pic="http://schemas.openxmlformats.org/drawingml/2006/picture">
-                  <wp:extent cx="666000" cy="666000"/>
+                  <wp:extent cx="1655999" cy="1347906"/>
                   <wp:docPr id="2" name="Picture 2"/>
                   <wp:cNvGraphicFramePr>
                     <a:graphicFrameLocks noChangeAspect="1"/>
@@ -1758,7 +1758,7 @@
                     <a:graphicData uri="http://schemas.openxmlformats.org/drawingml/2006/picture">
                       <pic:pic>
                         <pic:nvPicPr>
-                          <pic:cNvPr id="0" name="logo-aura-gota.png"/>
+                          <pic:cNvPr id="0" name="logo-aura-slogan-header.png"/>
                           <pic:cNvPicPr/>
                         </pic:nvPicPr>
                         <pic:blipFill>
@@ -1770,7 +1770,7 @@
                         <pic:spPr>
                           <a:xfrm>
                             <a:off x="0" y="0"/>
-                            <a:ext cx="666000" cy="666000"/>
+                            <a:ext cx="1655999" cy="1347906"/>
                           </a:xfrm>
                           <a:prstGeom prst="rect"/>
                         </pic:spPr>
@@ -1784,12 +1784,12 @@
         </w:tc>
         <w:tc>
           <w:tcPr>
-            <w:tcW w:type="dxa" w:w="8220"/>
-            <w:shd w:fill="0E4F72" w:val="clear"/>
+            <w:tcW w:type="dxa" w:w="6746"/>
+            <w:shd w:fill="FFFFFF" w:val="clear"/>
             <w:tcMar>
-              <w:top w:w="80" w:type="dxa"/>
+              <w:top w:w="60" w:type="dxa"/>
               <w:left w:w="80" w:type="dxa"/>
-              <w:bottom w:w="80" w:type="dxa"/>
+              <w:bottom w:w="60" w:type="dxa"/>
               <w:right w:w="80" w:type="dxa"/>
             </w:tcMar>
           </w:tcPr>
@@ -1803,7 +1803,7 @@
                 <w:rFonts w:ascii="Arial" w:hAnsi="Arial" w:eastAsia="Arial"/>
                 <w:b w:val="0"/>
                 <w:i w:val="0"/>
-                <w:color w:val="FFFFFF"/>
+                <w:color w:val="5C4F54"/>
                 <w:sz w:val="16"/>
               </w:rPr>
               <w:t>UNIVERSIDAD CATÓLICA DE CUYO · Secretaría de Investigación y Extensión</w:t>
@@ -1819,8 +1819,8 @@
                 <w:rFonts w:ascii="Arial" w:hAnsi="Arial" w:eastAsia="Arial"/>
                 <w:b/>
                 <w:i w:val="0"/>
-                <w:color w:val="FFFFFF"/>
-                <w:sz w:val="26"/>
+                <w:color w:val="0E4F72"/>
+                <w:sz w:val="24"/>
               </w:rPr>
               <w:t>Plan Integral AURA · Convocatoria 2026</w:t>
             </w:r>
@@ -1835,7 +1835,7 @@
                 <w:rFonts w:ascii="Arial" w:hAnsi="Arial" w:eastAsia="Arial"/>
                 <w:b w:val="0"/>
                 <w:i w:val="0"/>
-                <w:color w:val="FFFFFF"/>
+                <w:color w:val="5C4F54"/>
                 <w:sz w:val="18"/>
               </w:rPr>
               <w:t>Parte B · Anexo I — Presentación de proyecto de investigación / extensión (plantilla Secretaría de Investigación, adaptada a AURA)</w:t>

</xml_diff>

<commit_message>
Fix broken hero layout caused by oversized slogan logo.
Stack a compact AURA mark above the title so it no longer covers the text and CTAs.

Co-authored-by: Cursor <cursoragent@cursor.com>
</commit_message>
<xml_diff>
--- a/instituto-del-agua/documentos/Convocatoria_y_Plantilla_Proyectos_AURA_2026.docx
+++ b/instituto-del-agua/documentos/Convocatoria_y_Plantilla_Proyectos_AURA_2026.docx
@@ -32,7 +32,7 @@
             <w:r>
               <w:drawing>
                 <wp:inline xmlns:a="http://schemas.openxmlformats.org/drawingml/2006/main" xmlns:pic="http://schemas.openxmlformats.org/drawingml/2006/picture">
-                  <wp:extent cx="1655999" cy="1347906"/>
+                  <wp:extent cx="1655999" cy="1342703"/>
                   <wp:docPr id="1" name="Picture 1"/>
                   <wp:cNvGraphicFramePr>
                     <a:graphicFrameLocks noChangeAspect="1"/>
@@ -53,7 +53,7 @@
                         <pic:spPr>
                           <a:xfrm>
                             <a:off x="0" y="0"/>
-                            <a:ext cx="1655999" cy="1347906"/>
+                            <a:ext cx="1655999" cy="1342703"/>
                           </a:xfrm>
                           <a:prstGeom prst="rect"/>
                         </pic:spPr>
@@ -1749,7 +1749,7 @@
             <w:r>
               <w:drawing>
                 <wp:inline xmlns:a="http://schemas.openxmlformats.org/drawingml/2006/main" xmlns:pic="http://schemas.openxmlformats.org/drawingml/2006/picture">
-                  <wp:extent cx="1655999" cy="1347906"/>
+                  <wp:extent cx="1655999" cy="1342703"/>
                   <wp:docPr id="2" name="Picture 2"/>
                   <wp:cNvGraphicFramePr>
                     <a:graphicFrameLocks noChangeAspect="1"/>
@@ -1770,7 +1770,7 @@
                         <pic:spPr>
                           <a:xfrm>
                             <a:off x="0" y="0"/>
-                            <a:ext cx="1655999" cy="1347906"/>
+                            <a:ext cx="1655999" cy="1342703"/>
                           </a:xfrm>
                           <a:prstGeom prst="rect"/>
                         </pic:spPr>

</xml_diff>

<commit_message>
Enlarge AURA slogan lettering in logo assets.
Rebuild the mark with larger Georgia text beside a cleaned droplet so the slogan stays readable in the hero and Word banners.

Co-authored-by: Cursor <cursoragent@cursor.com>
</commit_message>
<xml_diff>
--- a/instituto-del-agua/documentos/Convocatoria_y_Plantilla_Proyectos_AURA_2026.docx
+++ b/instituto-del-agua/documentos/Convocatoria_y_Plantilla_Proyectos_AURA_2026.docx
@@ -32,7 +32,7 @@
             <w:r>
               <w:drawing>
                 <wp:inline xmlns:a="http://schemas.openxmlformats.org/drawingml/2006/main" xmlns:pic="http://schemas.openxmlformats.org/drawingml/2006/picture">
-                  <wp:extent cx="1655999" cy="1342703"/>
+                  <wp:extent cx="1944000" cy="1041429"/>
                   <wp:docPr id="1" name="Picture 1"/>
                   <wp:cNvGraphicFramePr>
                     <a:graphicFrameLocks noChangeAspect="1"/>
@@ -41,7 +41,7 @@
                     <a:graphicData uri="http://schemas.openxmlformats.org/drawingml/2006/picture">
                       <pic:pic>
                         <pic:nvPicPr>
-                          <pic:cNvPr id="0" name="logo-aura-slogan-header.png"/>
+                          <pic:cNvPr id="0" name="logo-aura-slogan-word.png"/>
                           <pic:cNvPicPr/>
                         </pic:nvPicPr>
                         <pic:blipFill>
@@ -53,7 +53,7 @@
                         <pic:spPr>
                           <a:xfrm>
                             <a:off x="0" y="0"/>
-                            <a:ext cx="1655999" cy="1342703"/>
+                            <a:ext cx="1944000" cy="1041429"/>
                           </a:xfrm>
                           <a:prstGeom prst="rect"/>
                         </pic:spPr>
@@ -1749,7 +1749,7 @@
             <w:r>
               <w:drawing>
                 <wp:inline xmlns:a="http://schemas.openxmlformats.org/drawingml/2006/main" xmlns:pic="http://schemas.openxmlformats.org/drawingml/2006/picture">
-                  <wp:extent cx="1655999" cy="1342703"/>
+                  <wp:extent cx="1944000" cy="1041429"/>
                   <wp:docPr id="2" name="Picture 2"/>
                   <wp:cNvGraphicFramePr>
                     <a:graphicFrameLocks noChangeAspect="1"/>
@@ -1758,7 +1758,7 @@
                     <a:graphicData uri="http://schemas.openxmlformats.org/drawingml/2006/picture">
                       <pic:pic>
                         <pic:nvPicPr>
-                          <pic:cNvPr id="0" name="logo-aura-slogan-header.png"/>
+                          <pic:cNvPr id="0" name="logo-aura-slogan-word.png"/>
                           <pic:cNvPicPr/>
                         </pic:nvPicPr>
                         <pic:blipFill>
@@ -1770,7 +1770,7 @@
                         <pic:spPr>
                           <a:xfrm>
                             <a:off x="0" y="0"/>
-                            <a:ext cx="1655999" cy="1342703"/>
+                            <a:ext cx="1944000" cy="1041429"/>
                           </a:xfrm>
                           <a:prstGeom prst="rect"/>
                         </pic:spPr>

</xml_diff>

<commit_message>
Clean droplet mark and keep slogan text large.
Co-authored-by: Cursor <cursoragent@cursor.com>
</commit_message>
<xml_diff>
--- a/instituto-del-agua/documentos/Convocatoria_y_Plantilla_Proyectos_AURA_2026.docx
+++ b/instituto-del-agua/documentos/Convocatoria_y_Plantilla_Proyectos_AURA_2026.docx
@@ -32,7 +32,7 @@
             <w:r>
               <w:drawing>
                 <wp:inline xmlns:a="http://schemas.openxmlformats.org/drawingml/2006/main" xmlns:pic="http://schemas.openxmlformats.org/drawingml/2006/picture">
-                  <wp:extent cx="1944000" cy="1041429"/>
+                  <wp:extent cx="1944000" cy="1060364"/>
                   <wp:docPr id="1" name="Picture 1"/>
                   <wp:cNvGraphicFramePr>
                     <a:graphicFrameLocks noChangeAspect="1"/>
@@ -53,7 +53,7 @@
                         <pic:spPr>
                           <a:xfrm>
                             <a:off x="0" y="0"/>
-                            <a:ext cx="1944000" cy="1041429"/>
+                            <a:ext cx="1944000" cy="1060364"/>
                           </a:xfrm>
                           <a:prstGeom prst="rect"/>
                         </pic:spPr>
@@ -1749,7 +1749,7 @@
             <w:r>
               <w:drawing>
                 <wp:inline xmlns:a="http://schemas.openxmlformats.org/drawingml/2006/main" xmlns:pic="http://schemas.openxmlformats.org/drawingml/2006/picture">
-                  <wp:extent cx="1944000" cy="1041429"/>
+                  <wp:extent cx="1944000" cy="1060364"/>
                   <wp:docPr id="2" name="Picture 2"/>
                   <wp:cNvGraphicFramePr>
                     <a:graphicFrameLocks noChangeAspect="1"/>
@@ -1770,7 +1770,7 @@
                         <pic:spPr>
                           <a:xfrm>
                             <a:off x="0" y="0"/>
-                            <a:ext cx="1944000" cy="1041429"/>
+                            <a:ext cx="1944000" cy="1060364"/>
                           </a:xfrm>
                           <a:prstGeom prst="rect"/>
                         </pic:spPr>

</xml_diff>

<commit_message>
Use the provided AURA slogan image across site and docs.
Co-authored-by: Cursor <cursoragent@cursor.com>
</commit_message>
<xml_diff>
--- a/instituto-del-agua/documentos/Convocatoria_y_Plantilla_Proyectos_AURA_2026.docx
+++ b/instituto-del-agua/documentos/Convocatoria_y_Plantilla_Proyectos_AURA_2026.docx
@@ -32,7 +32,7 @@
             <w:r>
               <w:drawing>
                 <wp:inline xmlns:a="http://schemas.openxmlformats.org/drawingml/2006/main" xmlns:pic="http://schemas.openxmlformats.org/drawingml/2006/picture">
-                  <wp:extent cx="1944000" cy="1060364"/>
+                  <wp:extent cx="1944000" cy="1570909"/>
                   <wp:docPr id="1" name="Picture 1"/>
                   <wp:cNvGraphicFramePr>
                     <a:graphicFrameLocks noChangeAspect="1"/>
@@ -53,7 +53,7 @@
                         <pic:spPr>
                           <a:xfrm>
                             <a:off x="0" y="0"/>
-                            <a:ext cx="1944000" cy="1060364"/>
+                            <a:ext cx="1944000" cy="1570909"/>
                           </a:xfrm>
                           <a:prstGeom prst="rect"/>
                         </pic:spPr>
@@ -1749,7 +1749,7 @@
             <w:r>
               <w:drawing>
                 <wp:inline xmlns:a="http://schemas.openxmlformats.org/drawingml/2006/main" xmlns:pic="http://schemas.openxmlformats.org/drawingml/2006/picture">
-                  <wp:extent cx="1944000" cy="1060364"/>
+                  <wp:extent cx="1944000" cy="1570909"/>
                   <wp:docPr id="2" name="Picture 2"/>
                   <wp:cNvGraphicFramePr>
                     <a:graphicFrameLocks noChangeAspect="1"/>
@@ -1770,7 +1770,7 @@
                         <pic:spPr>
                           <a:xfrm>
                             <a:off x="0" y="0"/>
-                            <a:ext cx="1944000" cy="1060364"/>
+                            <a:ext cx="1944000" cy="1570909"/>
                           </a:xfrm>
                           <a:prstGeom prst="rect"/>
                         </pic:spPr>

</xml_diff>